<commit_message>
feat: continuacao das atividades de bd 25 ao 29
</commit_message>
<xml_diff>
--- a/2° Módulo/BD 2 - Banco de Dados 2/Exercicios_BD2.docx
+++ b/2° Módulo/BD 2 - Banco de Dados 2/Exercicios_BD2.docx
@@ -4588,6 +4588,9 @@
     </w:p>
     <w:p>
       <w:r>
+        <w:rPr>
+          <w:noProof/>
+        </w:rPr>
         <w:drawing>
           <wp:inline distT="0" distB="0" distL="0" distR="0" wp14:anchorId="405B6EF5" wp14:editId="4A52EF85">
             <wp:extent cx="3302000" cy="2102579"/>
@@ -9130,6 +9133,7 @@
       <w:r>
         <w:rPr>
           <w:rFonts w:cs="Arial"/>
+          <w:noProof/>
         </w:rPr>
         <w:drawing>
           <wp:inline distT="0" distB="0" distL="0" distR="0" wp14:anchorId="1C2684C6" wp14:editId="68E8A266">
@@ -9254,6 +9258,9 @@
     </w:p>
     <w:p>
       <w:r>
+        <w:rPr>
+          <w:noProof/>
+        </w:rPr>
         <w:drawing>
           <wp:inline distT="0" distB="0" distL="0" distR="0" wp14:anchorId="7EC3B806" wp14:editId="1C6B5F1B">
             <wp:extent cx="3873346" cy="2063750"/>
@@ -9309,10 +9316,7 @@
         <w:pStyle w:val="Ttulo4"/>
       </w:pPr>
       <w:r>
-        <w:t>Problema</w:t>
-      </w:r>
-      <w:r>
-        <w:t xml:space="preserve"> 2</w:t>
+        <w:t>Problema 2</w:t>
       </w:r>
       <w:r>
         <w:t>3</w:t>
@@ -9382,6 +9386,9 @@
     </w:p>
     <w:p>
       <w:r>
+        <w:rPr>
+          <w:noProof/>
+        </w:rPr>
         <w:drawing>
           <wp:inline distT="0" distB="0" distL="0" distR="0" wp14:anchorId="6A7D124F" wp14:editId="1F40C079">
             <wp:extent cx="5604470" cy="1549400"/>
@@ -9466,13 +9473,7 @@
     </w:p>
     <w:p>
       <w:r>
-        <w:t xml:space="preserve">Em que cidades </w:t>
-      </w:r>
-      <w:r>
-        <w:t>as nossas empresas possuem</w:t>
-      </w:r>
-      <w:r>
-        <w:t xml:space="preserve"> clientes?</w:t>
+        <w:t>Em que cidades as nossas empresas possuem clientes?</w:t>
       </w:r>
     </w:p>
     <w:p>
@@ -9511,6 +9512,9 @@
     </w:p>
     <w:p>
       <w:r>
+        <w:rPr>
+          <w:noProof/>
+        </w:rPr>
         <w:drawing>
           <wp:inline distT="0" distB="0" distL="0" distR="0" wp14:anchorId="066A2694" wp14:editId="21E7065A">
             <wp:extent cx="3953042" cy="4286250"/>
@@ -9585,10 +9589,7 @@
         <w:pStyle w:val="Ttulo4"/>
       </w:pPr>
       <w:r>
-        <w:t>Problema</w:t>
-      </w:r>
-      <w:r>
-        <w:t xml:space="preserve"> 2</w:t>
+        <w:t>Problema 2</w:t>
       </w:r>
       <w:r>
         <w:t>5</w:t>
@@ -9679,6 +9680,9 @@
     </w:p>
     <w:p>
       <w:r>
+        <w:rPr>
+          <w:noProof/>
+        </w:rPr>
         <w:drawing>
           <wp:inline distT="0" distB="0" distL="0" distR="0" wp14:anchorId="72A01223" wp14:editId="5F1E6428">
             <wp:extent cx="4466300" cy="4203700"/>
@@ -9774,24 +9778,12 @@
         <w:pStyle w:val="Ttulo4"/>
       </w:pPr>
       <w:r>
-        <w:t>Problema</w:t>
-      </w:r>
-      <w:r>
-        <w:t xml:space="preserve"> 25</w:t>
-      </w:r>
-      <w:r>
-        <w:t>:</w:t>
-      </w:r>
-    </w:p>
-    <w:p>
-      <w:r>
-        <w:t xml:space="preserve">Listar os </w:t>
-      </w:r>
-      <w:r>
-        <w:t>pedidos</w:t>
-      </w:r>
-      <w:r>
-        <w:t xml:space="preserve"> que possuam mais de um item.</w:t>
+        <w:t>Problema 25:</w:t>
+      </w:r>
+    </w:p>
+    <w:p>
+      <w:r>
+        <w:t>Listar os pedidos que possuam mais de um item.</w:t>
       </w:r>
     </w:p>
     <w:p>
@@ -9888,6 +9880,9 @@
     <w:p/>
     <w:p>
       <w:r>
+        <w:rPr>
+          <w:noProof/>
+        </w:rPr>
         <w:drawing>
           <wp:inline distT="0" distB="0" distL="0" distR="0" wp14:anchorId="776DC333" wp14:editId="594165C8">
             <wp:extent cx="4015448" cy="2254203"/>
@@ -9925,6 +9920,978 @@
         </w:drawing>
       </w:r>
     </w:p>
+    <w:p>
+      <w:pPr>
+        <w:pStyle w:val="Ttulo1"/>
+      </w:pPr>
+      <w:r>
+        <w:lastRenderedPageBreak/>
+        <w:t>6.6 Recuperando Dados de Várias Tabelas (JOINS)</w:t>
+      </w:r>
+      <w:r>
+        <w:t xml:space="preserve"> 17/06/2026</w:t>
+      </w:r>
+    </w:p>
+    <w:p>
+      <w:r>
+        <w:t>Algumas consultas necessitam acessar simultaneamente várias tabelas, o que leva à realização de junções (JOINS) entre as tabelas para poder extrair as informações necessárias para a consulta formulada.</w:t>
+      </w:r>
+    </w:p>
+    <w:p>
+      <w:pPr>
+        <w:rPr>
+          <w:b/>
+          <w:bCs/>
+        </w:rPr>
+      </w:pPr>
+      <w:r>
+        <w:rPr>
+          <w:b/>
+          <w:bCs/>
+        </w:rPr>
+        <w:t>6.6.1 Qualificadores de Nomes</w:t>
+      </w:r>
+    </w:p>
+    <w:p>
+      <w:r>
+        <w:t>Um qualificador de nome consiste do nome da tabela, seguido de um ponto,</w:t>
+      </w:r>
+      <w:r>
+        <w:t xml:space="preserve"> </w:t>
+      </w:r>
+      <w:r>
+        <w:t>seguido por um nome de uma coluna da tabela. Por exemplo, o qualificador da coluna DESC_PROD da tabela PRODUTO será PRODUTO.DESC_PROD. Os qualificadores de nome são utilizados em uma consulta para efetivar a junção (JOIN) entre as tabelas.</w:t>
+      </w:r>
+    </w:p>
+    <w:p>
+      <w:pPr>
+        <w:pStyle w:val="Ttulo4"/>
+      </w:pPr>
+      <w:r>
+        <w:t>Problema</w:t>
+      </w:r>
+      <w:r>
+        <w:t xml:space="preserve"> 26 A</w:t>
+      </w:r>
+      <w:r>
+        <w:t>:</w:t>
+      </w:r>
+    </w:p>
+    <w:p>
+      <w:r>
+        <w:t>Faça uma junção da tabela de clientes com a de pedidos, exibindo o nome do cliente, o código do cliente e o número do pedido.</w:t>
+      </w:r>
+    </w:p>
+    <w:p>
+      <w:pPr>
+        <w:ind w:left="708" w:firstLine="1"/>
+      </w:pPr>
+      <w:r>
+        <w:rPr>
+          <w:b/>
+          <w:bCs/>
+        </w:rPr>
+        <w:t>Código:</w:t>
+      </w:r>
+      <w:r>
+        <w:br/>
+      </w:r>
+      <w:r>
+        <w:t xml:space="preserve">SELECT </w:t>
+      </w:r>
+      <w:proofErr w:type="spellStart"/>
+      <w:r>
+        <w:t>cod_</w:t>
+      </w:r>
+      <w:proofErr w:type="gramStart"/>
+      <w:r>
+        <w:t>cli,nome</w:t>
+      </w:r>
+      <w:proofErr w:type="gramEnd"/>
+      <w:r>
+        <w:t>_cli</w:t>
+      </w:r>
+      <w:proofErr w:type="spellEnd"/>
+      <w:r>
+        <w:t xml:space="preserve">, </w:t>
+      </w:r>
+      <w:proofErr w:type="spellStart"/>
+      <w:r>
+        <w:t>pedido.num_ped</w:t>
+      </w:r>
+      <w:proofErr w:type="spellEnd"/>
+    </w:p>
+    <w:p>
+      <w:r>
+        <w:t xml:space="preserve">FROM </w:t>
+      </w:r>
+      <w:r>
+        <w:t>cliente, pedido;</w:t>
+      </w:r>
+    </w:p>
+    <w:p>
+      <w:r>
+        <w:drawing>
+          <wp:inline distT="0" distB="0" distL="0" distR="0" wp14:anchorId="11180CC4" wp14:editId="6227C13F">
+            <wp:extent cx="3483980" cy="3559037"/>
+            <wp:effectExtent l="0" t="0" r="2540" b="3810"/>
+            <wp:docPr id="30" name="Imagem 30"/>
+            <wp:cNvGraphicFramePr>
+              <a:graphicFrameLocks xmlns:a="http://schemas.openxmlformats.org/drawingml/2006/main" noChangeAspect="1"/>
+            </wp:cNvGraphicFramePr>
+            <a:graphic xmlns:a="http://schemas.openxmlformats.org/drawingml/2006/main">
+              <a:graphicData uri="http://schemas.openxmlformats.org/drawingml/2006/picture">
+                <pic:pic xmlns:pic="http://schemas.openxmlformats.org/drawingml/2006/picture">
+                  <pic:nvPicPr>
+                    <pic:cNvPr id="1" name=""/>
+                    <pic:cNvPicPr/>
+                  </pic:nvPicPr>
+                  <pic:blipFill>
+                    <a:blip r:embed="rId62"/>
+                    <a:stretch>
+                      <a:fillRect/>
+                    </a:stretch>
+                  </pic:blipFill>
+                  <pic:spPr>
+                    <a:xfrm>
+                      <a:off x="0" y="0"/>
+                      <a:ext cx="3515604" cy="3591343"/>
+                    </a:xfrm>
+                    <a:prstGeom prst="rect">
+                      <a:avLst/>
+                    </a:prstGeom>
+                  </pic:spPr>
+                </pic:pic>
+              </a:graphicData>
+            </a:graphic>
+          </wp:inline>
+        </w:drawing>
+      </w:r>
+    </w:p>
+    <w:p>
+      <w:r>
+        <w:lastRenderedPageBreak/>
+        <w:t>Neste exemplo foi executado um produto cartesiano das tabelas CLIENTE e PEDIDO, seguido de uma projeção das colunas exibidas. Neste caso, poucas informações úteis podem ser extraídas da relação resultante. Devemos então aplicar critérios de seleção à junção para podermos obter algum resultado concreto.</w:t>
+      </w:r>
+    </w:p>
+    <w:p/>
+    <w:p>
+      <w:pPr>
+        <w:pStyle w:val="Ttulo4"/>
+      </w:pPr>
+      <w:r>
+        <w:t>Problema</w:t>
+      </w:r>
+      <w:r>
+        <w:t xml:space="preserve"> 26 B</w:t>
+      </w:r>
+      <w:r>
+        <w:t>:</w:t>
+      </w:r>
+    </w:p>
+    <w:p>
+      <w:r>
+        <w:t>A que clientes estão associados os pedidos existentes? Listar pelos nomes dos clientes.</w:t>
+      </w:r>
+    </w:p>
+    <w:p>
+      <w:pPr>
+        <w:rPr>
+          <w:b/>
+          <w:bCs/>
+        </w:rPr>
+      </w:pPr>
+      <w:r>
+        <w:rPr>
+          <w:b/>
+          <w:bCs/>
+        </w:rPr>
+        <w:t>Código:</w:t>
+      </w:r>
+    </w:p>
+    <w:p>
+      <w:proofErr w:type="spellStart"/>
+      <w:r>
+        <w:t>select</w:t>
+      </w:r>
+      <w:proofErr w:type="spellEnd"/>
+      <w:r>
+        <w:t xml:space="preserve"> </w:t>
+      </w:r>
+      <w:proofErr w:type="spellStart"/>
+      <w:r>
+        <w:t>nome_cli</w:t>
+      </w:r>
+      <w:proofErr w:type="spellEnd"/>
+      <w:r>
+        <w:t xml:space="preserve">, </w:t>
+      </w:r>
+      <w:proofErr w:type="spellStart"/>
+      <w:r>
+        <w:t>pedido.cd_cli</w:t>
+      </w:r>
+      <w:proofErr w:type="spellEnd"/>
+      <w:r>
+        <w:t xml:space="preserve">, </w:t>
+      </w:r>
+      <w:proofErr w:type="spellStart"/>
+      <w:r>
+        <w:t>pedido.num_ped</w:t>
+      </w:r>
+      <w:proofErr w:type="spellEnd"/>
+    </w:p>
+    <w:p>
+      <w:proofErr w:type="spellStart"/>
+      <w:r>
+        <w:t>from</w:t>
+      </w:r>
+      <w:proofErr w:type="spellEnd"/>
+      <w:r>
+        <w:t xml:space="preserve"> cliente, pedido</w:t>
+      </w:r>
+    </w:p>
+    <w:p>
+      <w:proofErr w:type="spellStart"/>
+      <w:r>
+        <w:t>where</w:t>
+      </w:r>
+      <w:proofErr w:type="spellEnd"/>
+      <w:r>
+        <w:t xml:space="preserve"> </w:t>
+      </w:r>
+      <w:proofErr w:type="spellStart"/>
+      <w:r>
+        <w:t>cliente.cod_cli</w:t>
+      </w:r>
+      <w:proofErr w:type="spellEnd"/>
+      <w:r>
+        <w:t>=</w:t>
+      </w:r>
+      <w:proofErr w:type="spellStart"/>
+      <w:r>
+        <w:t>pedido.cd_cli</w:t>
+      </w:r>
+      <w:proofErr w:type="spellEnd"/>
+      <w:r>
+        <w:t>;</w:t>
+      </w:r>
+    </w:p>
+    <w:p>
+      <w:r>
+        <w:drawing>
+          <wp:inline distT="0" distB="0" distL="0" distR="0" wp14:anchorId="1CD2D4DE" wp14:editId="3428D8DA">
+            <wp:extent cx="5400040" cy="3485515"/>
+            <wp:effectExtent l="0" t="0" r="0" b="635"/>
+            <wp:docPr id="31" name="Imagem 31"/>
+            <wp:cNvGraphicFramePr>
+              <a:graphicFrameLocks xmlns:a="http://schemas.openxmlformats.org/drawingml/2006/main" noChangeAspect="1"/>
+            </wp:cNvGraphicFramePr>
+            <a:graphic xmlns:a="http://schemas.openxmlformats.org/drawingml/2006/main">
+              <a:graphicData uri="http://schemas.openxmlformats.org/drawingml/2006/picture">
+                <pic:pic xmlns:pic="http://schemas.openxmlformats.org/drawingml/2006/picture">
+                  <pic:nvPicPr>
+                    <pic:cNvPr id="1" name=""/>
+                    <pic:cNvPicPr/>
+                  </pic:nvPicPr>
+                  <pic:blipFill>
+                    <a:blip r:embed="rId63"/>
+                    <a:stretch>
+                      <a:fillRect/>
+                    </a:stretch>
+                  </pic:blipFill>
+                  <pic:spPr>
+                    <a:xfrm>
+                      <a:off x="0" y="0"/>
+                      <a:ext cx="5400040" cy="3485515"/>
+                    </a:xfrm>
+                    <a:prstGeom prst="rect">
+                      <a:avLst/>
+                    </a:prstGeom>
+                  </pic:spPr>
+                </pic:pic>
+              </a:graphicData>
+            </a:graphic>
+          </wp:inline>
+        </w:drawing>
+      </w:r>
+    </w:p>
+    <w:p>
+      <w:pPr>
+        <w:spacing w:line="278" w:lineRule="auto"/>
+        <w:ind w:firstLine="0"/>
+        <w:jc w:val="left"/>
+      </w:pPr>
+      <w:r>
+        <w:br w:type="page"/>
+      </w:r>
+    </w:p>
+    <w:p>
+      <w:pPr>
+        <w:pStyle w:val="Ttulo4"/>
+      </w:pPr>
+      <w:proofErr w:type="spellStart"/>
+      <w:r>
+        <w:lastRenderedPageBreak/>
+        <w:t>Questao</w:t>
+      </w:r>
+      <w:proofErr w:type="spellEnd"/>
+      <w:r>
+        <w:t xml:space="preserve"> 26 C</w:t>
+      </w:r>
+    </w:p>
+    <w:p>
+      <w:r>
+        <w:t>A equação apresentada na cláusula WHERE é chamada de EQUAÇÃO DE JUNÇÃO.</w:t>
+      </w:r>
+    </w:p>
+    <w:p>
+      <w:r>
+        <w:t>Podemos utilizar os operadores LIKE, NOT LIKE, IN, NOT IN, NULL, NOT NULL, os operadores relacionais e operadores AND, OR e NOT, na cláusula WHERE de uma junção de tabelas.</w:t>
+      </w:r>
+    </w:p>
+    <w:p/>
+    <w:p>
+      <w:pPr>
+        <w:pStyle w:val="Ttulo4"/>
+      </w:pPr>
+      <w:r>
+        <w:t>Problema 27:</w:t>
+      </w:r>
+    </w:p>
+    <w:p>
+      <w:r>
+        <w:t>Quais são os clientes que têm pedidos com prazos de entrega superiores a 15 dias e que estão localizados nos estados de São Paulo ou do Rio de Janeiro?</w:t>
+      </w:r>
+    </w:p>
+    <w:p>
+      <w:pPr>
+        <w:rPr>
+          <w:b/>
+          <w:bCs/>
+        </w:rPr>
+      </w:pPr>
+      <w:r>
+        <w:rPr>
+          <w:b/>
+          <w:bCs/>
+        </w:rPr>
+        <w:t>Código:</w:t>
+      </w:r>
+    </w:p>
+    <w:p>
+      <w:r>
+        <w:t xml:space="preserve">SELECT </w:t>
+      </w:r>
+      <w:proofErr w:type="spellStart"/>
+      <w:proofErr w:type="gramStart"/>
+      <w:r>
+        <w:t>c.nome</w:t>
+      </w:r>
+      <w:proofErr w:type="gramEnd"/>
+      <w:r>
+        <w:t>_cli</w:t>
+      </w:r>
+      <w:proofErr w:type="spellEnd"/>
+      <w:r>
+        <w:t xml:space="preserve">, </w:t>
+      </w:r>
+      <w:proofErr w:type="spellStart"/>
+      <w:r>
+        <w:t>c.uf</w:t>
+      </w:r>
+      <w:proofErr w:type="spellEnd"/>
+      <w:r>
+        <w:t xml:space="preserve">, </w:t>
+      </w:r>
+      <w:proofErr w:type="spellStart"/>
+      <w:r>
+        <w:t>p.num_ped</w:t>
+      </w:r>
+      <w:proofErr w:type="spellEnd"/>
+      <w:r>
+        <w:t xml:space="preserve">, </w:t>
+      </w:r>
+      <w:proofErr w:type="spellStart"/>
+      <w:r>
+        <w:t>p.prazo_entr</w:t>
+      </w:r>
+      <w:proofErr w:type="spellEnd"/>
+      <w:r>
+        <w:t xml:space="preserve"> </w:t>
+      </w:r>
+    </w:p>
+    <w:p>
+      <w:r>
+        <w:t xml:space="preserve">FROM cliente c </w:t>
+      </w:r>
+    </w:p>
+    <w:p>
+      <w:r>
+        <w:t xml:space="preserve">INNER JOIN pedido p ON </w:t>
+      </w:r>
+      <w:proofErr w:type="spellStart"/>
+      <w:r>
+        <w:t>c.cod_cli</w:t>
+      </w:r>
+      <w:proofErr w:type="spellEnd"/>
+      <w:r>
+        <w:t xml:space="preserve"> = </w:t>
+      </w:r>
+      <w:proofErr w:type="spellStart"/>
+      <w:r>
+        <w:t>p.cd_cli</w:t>
+      </w:r>
+      <w:proofErr w:type="spellEnd"/>
+      <w:r>
+        <w:t xml:space="preserve"> </w:t>
+      </w:r>
+    </w:p>
+    <w:p>
+      <w:r>
+        <w:rPr>
+          <w:b/>
+          <w:bCs/>
+        </w:rPr>
+        <w:drawing>
+          <wp:anchor distT="0" distB="0" distL="114300" distR="114300" simplePos="0" relativeHeight="251658240" behindDoc="1" locked="0" layoutInCell="1" allowOverlap="1" wp14:anchorId="07F1F1AF" wp14:editId="19124A02">
+            <wp:simplePos x="0" y="0"/>
+            <wp:positionH relativeFrom="column">
+              <wp:posOffset>-472489</wp:posOffset>
+            </wp:positionH>
+            <wp:positionV relativeFrom="paragraph">
+              <wp:posOffset>468727</wp:posOffset>
+            </wp:positionV>
+            <wp:extent cx="6304875" cy="1348325"/>
+            <wp:effectExtent l="0" t="0" r="1270" b="4445"/>
+            <wp:wrapTight wrapText="bothSides">
+              <wp:wrapPolygon edited="0">
+                <wp:start x="0" y="0"/>
+                <wp:lineTo x="0" y="21366"/>
+                <wp:lineTo x="21539" y="21366"/>
+                <wp:lineTo x="21539" y="0"/>
+                <wp:lineTo x="0" y="0"/>
+              </wp:wrapPolygon>
+            </wp:wrapTight>
+            <wp:docPr id="32" name="Imagem 32"/>
+            <wp:cNvGraphicFramePr>
+              <a:graphicFrameLocks xmlns:a="http://schemas.openxmlformats.org/drawingml/2006/main" noChangeAspect="1"/>
+            </wp:cNvGraphicFramePr>
+            <a:graphic xmlns:a="http://schemas.openxmlformats.org/drawingml/2006/main">
+              <a:graphicData uri="http://schemas.openxmlformats.org/drawingml/2006/picture">
+                <pic:pic xmlns:pic="http://schemas.openxmlformats.org/drawingml/2006/picture">
+                  <pic:nvPicPr>
+                    <pic:cNvPr id="1" name=""/>
+                    <pic:cNvPicPr/>
+                  </pic:nvPicPr>
+                  <pic:blipFill>
+                    <a:blip r:embed="rId64" cstate="print">
+                      <a:extLst>
+                        <a:ext uri="{28A0092B-C50C-407E-A947-70E740481C1C}">
+                          <a14:useLocalDpi xmlns:a14="http://schemas.microsoft.com/office/drawing/2010/main" val="0"/>
+                        </a:ext>
+                      </a:extLst>
+                    </a:blip>
+                    <a:stretch>
+                      <a:fillRect/>
+                    </a:stretch>
+                  </pic:blipFill>
+                  <pic:spPr>
+                    <a:xfrm flipV="1">
+                      <a:off x="0" y="0"/>
+                      <a:ext cx="6304875" cy="1348325"/>
+                    </a:xfrm>
+                    <a:prstGeom prst="rect">
+                      <a:avLst/>
+                    </a:prstGeom>
+                  </pic:spPr>
+                </pic:pic>
+              </a:graphicData>
+            </a:graphic>
+          </wp:anchor>
+        </w:drawing>
+      </w:r>
+      <w:r>
+        <w:t xml:space="preserve">WHERE </w:t>
+      </w:r>
+      <w:proofErr w:type="spellStart"/>
+      <w:proofErr w:type="gramStart"/>
+      <w:r>
+        <w:t>p.prazo</w:t>
+      </w:r>
+      <w:proofErr w:type="gramEnd"/>
+      <w:r>
+        <w:t>_entr</w:t>
+      </w:r>
+      <w:proofErr w:type="spellEnd"/>
+      <w:r>
+        <w:t xml:space="preserve"> &gt; 15 AND </w:t>
+      </w:r>
+      <w:proofErr w:type="spellStart"/>
+      <w:r>
+        <w:t>c.uf</w:t>
+      </w:r>
+      <w:proofErr w:type="spellEnd"/>
+      <w:r>
+        <w:t xml:space="preserve"> IN ('</w:t>
+      </w:r>
+      <w:proofErr w:type="spellStart"/>
+      <w:r>
+        <w:t>sp</w:t>
+      </w:r>
+      <w:proofErr w:type="spellEnd"/>
+      <w:r>
+        <w:t>', '</w:t>
+      </w:r>
+      <w:proofErr w:type="spellStart"/>
+      <w:r>
+        <w:t>rj</w:t>
+      </w:r>
+      <w:proofErr w:type="spellEnd"/>
+      <w:r>
+        <w:t>');</w:t>
+      </w:r>
+    </w:p>
+    <w:p>
+      <w:pPr>
+        <w:rPr>
+          <w:b/>
+          <w:bCs/>
+        </w:rPr>
+      </w:pPr>
+    </w:p>
+    <w:p>
+      <w:pPr>
+        <w:rPr>
+          <w:b/>
+          <w:bCs/>
+        </w:rPr>
+      </w:pPr>
+    </w:p>
+    <w:p/>
+    <w:p/>
+    <w:p>
+      <w:pPr>
+        <w:spacing w:line="278" w:lineRule="auto"/>
+        <w:ind w:firstLine="0"/>
+        <w:jc w:val="left"/>
+        <w:rPr>
+          <w:rFonts w:eastAsia="Arial" w:cstheme="majorBidi"/>
+          <w:b/>
+          <w:iCs/>
+        </w:rPr>
+      </w:pPr>
+      <w:r>
+        <w:br w:type="page"/>
+      </w:r>
+    </w:p>
+    <w:p>
+      <w:pPr>
+        <w:pStyle w:val="Ttulo4"/>
+      </w:pPr>
+      <w:r>
+        <w:lastRenderedPageBreak/>
+        <w:t>Problema</w:t>
+      </w:r>
+      <w:r>
+        <w:t xml:space="preserve"> 28</w:t>
+      </w:r>
+      <w:r>
+        <w:t>:</w:t>
+      </w:r>
+    </w:p>
+    <w:p>
+      <w:r>
+        <w:t>Mostrar os pedidos dos clientes e seus respectivos prazos de entrega, ordenados do maior para o menor.</w:t>
+      </w:r>
+    </w:p>
+    <w:p>
+      <w:pPr>
+        <w:rPr>
+          <w:b/>
+          <w:bCs/>
+        </w:rPr>
+      </w:pPr>
+      <w:r>
+        <w:rPr>
+          <w:b/>
+          <w:bCs/>
+        </w:rPr>
+        <w:t>Código:</w:t>
+      </w:r>
+    </w:p>
+    <w:p>
+      <w:r>
+        <w:t xml:space="preserve">SELECT </w:t>
+      </w:r>
+      <w:proofErr w:type="spellStart"/>
+      <w:proofErr w:type="gramStart"/>
+      <w:r>
+        <w:t>c.nome</w:t>
+      </w:r>
+      <w:proofErr w:type="gramEnd"/>
+      <w:r>
+        <w:t>_cli</w:t>
+      </w:r>
+      <w:proofErr w:type="spellEnd"/>
+      <w:r>
+        <w:t xml:space="preserve">, </w:t>
+      </w:r>
+      <w:proofErr w:type="spellStart"/>
+      <w:r>
+        <w:t>p.num_ped</w:t>
+      </w:r>
+      <w:proofErr w:type="spellEnd"/>
+      <w:r>
+        <w:t xml:space="preserve">, </w:t>
+      </w:r>
+      <w:proofErr w:type="spellStart"/>
+      <w:r>
+        <w:t>p.prazo_entr</w:t>
+      </w:r>
+      <w:proofErr w:type="spellEnd"/>
+    </w:p>
+    <w:p>
+      <w:r>
+        <w:t>FROM cliente c</w:t>
+      </w:r>
+    </w:p>
+    <w:p>
+      <w:r>
+        <w:t xml:space="preserve">INNER JOIN pedido p ON </w:t>
+      </w:r>
+      <w:proofErr w:type="spellStart"/>
+      <w:r>
+        <w:t>c.cod_cli</w:t>
+      </w:r>
+      <w:proofErr w:type="spellEnd"/>
+      <w:r>
+        <w:t xml:space="preserve"> = </w:t>
+      </w:r>
+      <w:proofErr w:type="spellStart"/>
+      <w:r>
+        <w:t>p.cd_cli</w:t>
+      </w:r>
+      <w:proofErr w:type="spellEnd"/>
+    </w:p>
+    <w:p>
+      <w:r>
+        <w:t xml:space="preserve">ORDER BY </w:t>
+      </w:r>
+      <w:proofErr w:type="spellStart"/>
+      <w:proofErr w:type="gramStart"/>
+      <w:r>
+        <w:t>p.prazo</w:t>
+      </w:r>
+      <w:proofErr w:type="gramEnd"/>
+      <w:r>
+        <w:t>_entr</w:t>
+      </w:r>
+      <w:proofErr w:type="spellEnd"/>
+      <w:r>
+        <w:t xml:space="preserve"> DESC;</w:t>
+      </w:r>
+    </w:p>
+    <w:p>
+      <w:pPr>
+        <w:rPr>
+          <w:b/>
+          <w:bCs/>
+        </w:rPr>
+      </w:pPr>
+      <w:r>
+        <w:rPr>
+          <w:b/>
+          <w:bCs/>
+        </w:rPr>
+        <w:drawing>
+          <wp:inline distT="0" distB="0" distL="0" distR="0" wp14:anchorId="2A1ACDE5" wp14:editId="7599A6A8">
+            <wp:extent cx="5400040" cy="2871470"/>
+            <wp:effectExtent l="0" t="0" r="0" b="5080"/>
+            <wp:docPr id="33" name="Imagem 33"/>
+            <wp:cNvGraphicFramePr>
+              <a:graphicFrameLocks xmlns:a="http://schemas.openxmlformats.org/drawingml/2006/main" noChangeAspect="1"/>
+            </wp:cNvGraphicFramePr>
+            <a:graphic xmlns:a="http://schemas.openxmlformats.org/drawingml/2006/main">
+              <a:graphicData uri="http://schemas.openxmlformats.org/drawingml/2006/picture">
+                <pic:pic xmlns:pic="http://schemas.openxmlformats.org/drawingml/2006/picture">
+                  <pic:nvPicPr>
+                    <pic:cNvPr id="1" name=""/>
+                    <pic:cNvPicPr/>
+                  </pic:nvPicPr>
+                  <pic:blipFill>
+                    <a:blip r:embed="rId65"/>
+                    <a:stretch>
+                      <a:fillRect/>
+                    </a:stretch>
+                  </pic:blipFill>
+                  <pic:spPr>
+                    <a:xfrm>
+                      <a:off x="0" y="0"/>
+                      <a:ext cx="5400040" cy="2871470"/>
+                    </a:xfrm>
+                    <a:prstGeom prst="rect">
+                      <a:avLst/>
+                    </a:prstGeom>
+                  </pic:spPr>
+                </pic:pic>
+              </a:graphicData>
+            </a:graphic>
+          </wp:inline>
+        </w:drawing>
+      </w:r>
+    </w:p>
+    <w:p/>
+    <w:p/>
+    <w:p>
+      <w:pPr>
+        <w:spacing w:line="278" w:lineRule="auto"/>
+        <w:ind w:firstLine="0"/>
+        <w:jc w:val="left"/>
+        <w:rPr>
+          <w:rFonts w:eastAsiaTheme="majorEastAsia" w:cs="Arial"/>
+          <w:b/>
+        </w:rPr>
+      </w:pPr>
+      <w:r>
+        <w:br w:type="page"/>
+      </w:r>
+    </w:p>
+    <w:p>
+      <w:pPr>
+        <w:pStyle w:val="Ttulo1"/>
+      </w:pPr>
+      <w:r>
+        <w:lastRenderedPageBreak/>
+        <w:t>Sinônimos</w:t>
+      </w:r>
+      <w:r>
+        <w:t xml:space="preserve"> 17/06/2026</w:t>
+      </w:r>
+    </w:p>
+    <w:p>
+      <w:r>
+        <w:t>Para que não seja necessário escrever o nome da tabela nas qualificações de nomes, podemos utilizar ALIASES definidos na própria consulta.</w:t>
+      </w:r>
+    </w:p>
+    <w:p>
+      <w:r>
+        <w:t>A definição dos ALIASES é feita na cláusula FROM, sendo então utilizada nas outras cláusulas (WHERE, ORDER BY, GROUP BY, HAVING e SELECT) de uma consulta.</w:t>
+      </w:r>
+    </w:p>
+    <w:p/>
+    <w:p>
+      <w:pPr>
+        <w:pStyle w:val="Ttulo4"/>
+      </w:pPr>
+      <w:r>
+        <w:t>Problema</w:t>
+      </w:r>
+      <w:r>
+        <w:t xml:space="preserve"> 29</w:t>
+      </w:r>
+      <w:r>
+        <w:t>:</w:t>
+      </w:r>
+    </w:p>
+    <w:p>
+      <w:r>
+        <w:t>Exibir os vendedores (ordenados por nome) que emitiram pedidos com prazos de entrega superiores a 15 dias e que tenham salários fixos iguais ou superiores a R$ 1.000,00.</w:t>
+      </w:r>
+    </w:p>
+    <w:p>
+      <w:pPr>
+        <w:rPr>
+          <w:b/>
+          <w:bCs/>
+        </w:rPr>
+      </w:pPr>
+      <w:r>
+        <w:rPr>
+          <w:b/>
+          <w:bCs/>
+        </w:rPr>
+        <w:t>Código:</w:t>
+      </w:r>
+    </w:p>
+    <w:p>
+      <w:r>
+        <w:t xml:space="preserve">SELECT DISTINCT </w:t>
+      </w:r>
+      <w:proofErr w:type="spellStart"/>
+      <w:proofErr w:type="gramStart"/>
+      <w:r>
+        <w:t>vendedor.nome</w:t>
+      </w:r>
+      <w:proofErr w:type="gramEnd"/>
+      <w:r>
+        <w:t>_vend</w:t>
+      </w:r>
+      <w:proofErr w:type="spellEnd"/>
+      <w:r>
+        <w:t xml:space="preserve">, </w:t>
+      </w:r>
+      <w:proofErr w:type="spellStart"/>
+      <w:r>
+        <w:t>vendedor.sal_fixo</w:t>
+      </w:r>
+      <w:proofErr w:type="spellEnd"/>
+    </w:p>
+    <w:p>
+      <w:r>
+        <w:t xml:space="preserve">FROM </w:t>
+      </w:r>
+      <w:proofErr w:type="gramStart"/>
+      <w:r>
+        <w:t>vendedor</w:t>
+      </w:r>
+      <w:proofErr w:type="gramEnd"/>
+      <w:r>
+        <w:t xml:space="preserve"> </w:t>
+      </w:r>
+      <w:proofErr w:type="spellStart"/>
+      <w:r>
+        <w:t>v</w:t>
+      </w:r>
+      <w:r>
+        <w:t>endedor</w:t>
+      </w:r>
+      <w:proofErr w:type="spellEnd"/>
+    </w:p>
+    <w:p>
+      <w:r>
+        <w:t>INNER JOIN pedido p</w:t>
+      </w:r>
+      <w:r>
+        <w:t>roduto</w:t>
+      </w:r>
+      <w:r>
+        <w:t xml:space="preserve"> ON </w:t>
+      </w:r>
+      <w:proofErr w:type="spellStart"/>
+      <w:r>
+        <w:t>vendedor.cod_vend</w:t>
+      </w:r>
+      <w:proofErr w:type="spellEnd"/>
+      <w:r>
+        <w:t xml:space="preserve"> = </w:t>
+      </w:r>
+      <w:proofErr w:type="spellStart"/>
+      <w:r>
+        <w:t>p</w:t>
+      </w:r>
+      <w:r>
+        <w:t>roduto</w:t>
+      </w:r>
+      <w:r>
+        <w:t>.cd_vend</w:t>
+      </w:r>
+      <w:proofErr w:type="spellEnd"/>
+    </w:p>
+    <w:p>
+      <w:r>
+        <w:t xml:space="preserve">WHERE </w:t>
+      </w:r>
+      <w:proofErr w:type="spellStart"/>
+      <w:proofErr w:type="gramStart"/>
+      <w:r>
+        <w:t>p</w:t>
+      </w:r>
+      <w:r>
+        <w:t>roduto</w:t>
+      </w:r>
+      <w:r>
+        <w:t>.prazo</w:t>
+      </w:r>
+      <w:proofErr w:type="gramEnd"/>
+      <w:r>
+        <w:t>_entr</w:t>
+      </w:r>
+      <w:proofErr w:type="spellEnd"/>
+      <w:r>
+        <w:t xml:space="preserve"> &gt; 15 </w:t>
+      </w:r>
+    </w:p>
+    <w:p>
+      <w:r>
+        <w:t xml:space="preserve">  AND </w:t>
+      </w:r>
+      <w:proofErr w:type="spellStart"/>
+      <w:r>
+        <w:t>vendedor.sal_fixo</w:t>
+      </w:r>
+      <w:proofErr w:type="spellEnd"/>
+      <w:r>
+        <w:t xml:space="preserve"> &gt;= 1000.00</w:t>
+      </w:r>
+    </w:p>
+    <w:p>
+      <w:r>
+        <w:t xml:space="preserve">ORDER BY </w:t>
+      </w:r>
+      <w:proofErr w:type="spellStart"/>
+      <w:proofErr w:type="gramStart"/>
+      <w:r>
+        <w:t>vendedor.nome</w:t>
+      </w:r>
+      <w:proofErr w:type="gramEnd"/>
+      <w:r>
+        <w:t>_vend</w:t>
+      </w:r>
+      <w:proofErr w:type="spellEnd"/>
+      <w:r>
+        <w:t>;</w:t>
+      </w:r>
+    </w:p>
+    <w:p>
+      <w:pPr>
+        <w:rPr>
+          <w:b/>
+          <w:bCs/>
+        </w:rPr>
+      </w:pPr>
+      <w:r>
+        <w:rPr>
+          <w:b/>
+          <w:bCs/>
+        </w:rPr>
+        <w:drawing>
+          <wp:inline distT="0" distB="0" distL="0" distR="0" wp14:anchorId="54FB6FFA" wp14:editId="2F738077">
+            <wp:extent cx="5400040" cy="1125220"/>
+            <wp:effectExtent l="0" t="0" r="0" b="0"/>
+            <wp:docPr id="34" name="Imagem 34"/>
+            <wp:cNvGraphicFramePr>
+              <a:graphicFrameLocks xmlns:a="http://schemas.openxmlformats.org/drawingml/2006/main" noChangeAspect="1"/>
+            </wp:cNvGraphicFramePr>
+            <a:graphic xmlns:a="http://schemas.openxmlformats.org/drawingml/2006/main">
+              <a:graphicData uri="http://schemas.openxmlformats.org/drawingml/2006/picture">
+                <pic:pic xmlns:pic="http://schemas.openxmlformats.org/drawingml/2006/picture">
+                  <pic:nvPicPr>
+                    <pic:cNvPr id="1" name=""/>
+                    <pic:cNvPicPr/>
+                  </pic:nvPicPr>
+                  <pic:blipFill>
+                    <a:blip r:embed="rId66"/>
+                    <a:stretch>
+                      <a:fillRect/>
+                    </a:stretch>
+                  </pic:blipFill>
+                  <pic:spPr>
+                    <a:xfrm>
+                      <a:off x="0" y="0"/>
+                      <a:ext cx="5400040" cy="1125220"/>
+                    </a:xfrm>
+                    <a:prstGeom prst="rect">
+                      <a:avLst/>
+                    </a:prstGeom>
+                  </pic:spPr>
+                </pic:pic>
+              </a:graphicData>
+            </a:graphic>
+          </wp:inline>
+        </w:drawing>
+      </w:r>
+    </w:p>
+    <w:p/>
     <w:sectPr>
       <w:pgSz w:w="11906" w:h="16838"/>
       <w:pgMar w:top="1418" w:right="1701" w:bottom="1418" w:left="1701" w:header="709" w:footer="709" w:gutter="0"/>

</xml_diff>